<commit_message>
Update R script to run with new participant ID
</commit_message>
<xml_diff>
--- a/r_scripts/readme.docx
+++ b/r_scripts/readme.docx
@@ -414,7 +414,39 @@
         <w:rPr>
           <w:rFonts w:ascii="Courier New" w:hAnsi="Courier New" w:cs="Courier New"/>
         </w:rPr>
-        <w:t>switch_click_glmer_and_</w:t>
+        <w:t>switch</w:t>
+      </w:r>
+      <w:r>
+        <w:rPr>
+          <w:rFonts w:ascii="Courier New" w:hAnsi="Courier New" w:cs="Courier New"/>
+        </w:rPr>
+        <w:t>_</w:t>
+      </w:r>
+      <w:r>
+        <w:rPr>
+          <w:rFonts w:ascii="Courier New" w:hAnsi="Courier New" w:cs="Courier New"/>
+        </w:rPr>
+        <w:t>child</w:t>
+      </w:r>
+      <w:proofErr w:type="spellEnd"/>
+      <w:r>
+        <w:rPr>
+          <w:rFonts w:ascii="Courier New" w:hAnsi="Courier New" w:cs="Courier New"/>
+        </w:rPr>
+        <w:t>(or)</w:t>
+      </w:r>
+      <w:proofErr w:type="spellStart"/>
+      <w:r>
+        <w:rPr>
+          <w:rFonts w:ascii="Courier New" w:hAnsi="Courier New" w:cs="Courier New"/>
+        </w:rPr>
+        <w:t>adult_</w:t>
+      </w:r>
+      <w:r>
+        <w:rPr>
+          <w:rFonts w:ascii="Courier New" w:hAnsi="Courier New" w:cs="Courier New"/>
+        </w:rPr>
+        <w:t>click_glmer_and_</w:t>
       </w:r>
       <w:proofErr w:type="gramStart"/>
       <w:r>
@@ -533,16 +565,6 @@
         </w:rPr>
         <w:t>Computers percent agreement between primary eye coder and reliability coder for one participant’s Left/Right eye direction coding, broken down by phase and trial type.</w:t>
       </w:r>
-    </w:p>
-    <w:p>
-      <w:pPr>
-        <w:spacing w:after="0"/>
-        <w:rPr>
-          <w:rFonts w:ascii="Arial" w:hAnsi="Arial" w:cs="Arial"/>
-          <w:b/>
-          <w:bCs/>
-        </w:rPr>
-      </w:pPr>
     </w:p>
     <w:p>
       <w:pPr>

</xml_diff>